<commit_message>
Highlight Android, iOS, Flutter, KMP, CMP in CV
Colors these five platform/tech keywords blue wherever they appear
(title, summary, experience, projects, awards) so they stand out to a
quick scan.

Co-Authored-By: Claude Sonnet 5 <noreply@anthropic.com>
</commit_message>
<xml_diff>
--- a/pdf/Malindu_Kirindegamaarachchi_CV.docx
+++ b/pdf/Malindu_Kirindegamaarachchi_CV.docx
@@ -27,18 +27,137 @@
           <w:rFonts w:ascii="Calibri" w:cs="Calibri" w:eastAsia="Calibri" w:hAnsi="Calibri"/>
           <w:b/>
           <w:bCs/>
+          <w:i w:val="false"/>
+          <w:iCs w:val="false"/>
           <w:color w:val="B3121C"/>
           <w:sz w:val="21"/>
           <w:szCs w:val="21"/>
         </w:rPr>
-        <w:t xml:space="preserve">Senior Mobile Engineer — iOS • Android • Flutter • KMP / CMP</w:t>
+        <w:t xml:space="preserve">Senior Mobile Engineer — </w:t>
+      </w:r>
+      <w:r>
+        <w:rPr>
+          <w:rFonts w:ascii="Calibri" w:cs="Calibri" w:eastAsia="Calibri" w:hAnsi="Calibri"/>
+          <w:b/>
+          <w:bCs/>
+          <w:i w:val="false"/>
+          <w:iCs w:val="false"/>
+          <w:color w:val="1D4ED8"/>
+          <w:sz w:val="21"/>
+          <w:szCs w:val="21"/>
+        </w:rPr>
+        <w:t xml:space="preserve">iOS</w:t>
+      </w:r>
+      <w:r>
+        <w:rPr>
+          <w:rFonts w:ascii="Calibri" w:cs="Calibri" w:eastAsia="Calibri" w:hAnsi="Calibri"/>
+          <w:b/>
+          <w:bCs/>
+          <w:i w:val="false"/>
+          <w:iCs w:val="false"/>
+          <w:color w:val="B3121C"/>
+          <w:sz w:val="21"/>
+          <w:szCs w:val="21"/>
+        </w:rPr>
+        <w:t xml:space="preserve"> • </w:t>
+      </w:r>
+      <w:r>
+        <w:rPr>
+          <w:rFonts w:ascii="Calibri" w:cs="Calibri" w:eastAsia="Calibri" w:hAnsi="Calibri"/>
+          <w:b/>
+          <w:bCs/>
+          <w:i w:val="false"/>
+          <w:iCs w:val="false"/>
+          <w:color w:val="1D4ED8"/>
+          <w:sz w:val="21"/>
+          <w:szCs w:val="21"/>
+        </w:rPr>
+        <w:t xml:space="preserve">Android</w:t>
+      </w:r>
+      <w:r>
+        <w:rPr>
+          <w:rFonts w:ascii="Calibri" w:cs="Calibri" w:eastAsia="Calibri" w:hAnsi="Calibri"/>
+          <w:b/>
+          <w:bCs/>
+          <w:i w:val="false"/>
+          <w:iCs w:val="false"/>
+          <w:color w:val="B3121C"/>
+          <w:sz w:val="21"/>
+          <w:szCs w:val="21"/>
+        </w:rPr>
+        <w:t xml:space="preserve"> • </w:t>
+      </w:r>
+      <w:r>
+        <w:rPr>
+          <w:rFonts w:ascii="Calibri" w:cs="Calibri" w:eastAsia="Calibri" w:hAnsi="Calibri"/>
+          <w:b/>
+          <w:bCs/>
+          <w:i w:val="false"/>
+          <w:iCs w:val="false"/>
+          <w:color w:val="1D4ED8"/>
+          <w:sz w:val="21"/>
+          <w:szCs w:val="21"/>
+        </w:rPr>
+        <w:t xml:space="preserve">Flutter</w:t>
+      </w:r>
+      <w:r>
+        <w:rPr>
+          <w:rFonts w:ascii="Calibri" w:cs="Calibri" w:eastAsia="Calibri" w:hAnsi="Calibri"/>
+          <w:b/>
+          <w:bCs/>
+          <w:i w:val="false"/>
+          <w:iCs w:val="false"/>
+          <w:color w:val="B3121C"/>
+          <w:sz w:val="21"/>
+          <w:szCs w:val="21"/>
+        </w:rPr>
+        <w:t xml:space="preserve"> • </w:t>
+      </w:r>
+      <w:r>
+        <w:rPr>
+          <w:rFonts w:ascii="Calibri" w:cs="Calibri" w:eastAsia="Calibri" w:hAnsi="Calibri"/>
+          <w:b/>
+          <w:bCs/>
+          <w:i w:val="false"/>
+          <w:iCs w:val="false"/>
+          <w:color w:val="1D4ED8"/>
+          <w:sz w:val="21"/>
+          <w:szCs w:val="21"/>
+        </w:rPr>
+        <w:t xml:space="preserve">KMP</w:t>
+      </w:r>
+      <w:r>
+        <w:rPr>
+          <w:rFonts w:ascii="Calibri" w:cs="Calibri" w:eastAsia="Calibri" w:hAnsi="Calibri"/>
+          <w:b/>
+          <w:bCs/>
+          <w:i w:val="false"/>
+          <w:iCs w:val="false"/>
+          <w:color w:val="B3121C"/>
+          <w:sz w:val="21"/>
+          <w:szCs w:val="21"/>
+        </w:rPr>
+        <w:t xml:space="preserve"> / </w:t>
+      </w:r>
+      <w:r>
+        <w:rPr>
+          <w:rFonts w:ascii="Calibri" w:cs="Calibri" w:eastAsia="Calibri" w:hAnsi="Calibri"/>
+          <w:b/>
+          <w:bCs/>
+          <w:i w:val="false"/>
+          <w:iCs w:val="false"/>
+          <w:color w:val="1D4ED8"/>
+          <w:sz w:val="21"/>
+          <w:szCs w:val="21"/>
+        </w:rPr>
+        <w:t xml:space="preserve">CMP</w:t>
       </w:r>
     </w:p>
     <w:p>
       <w:pPr>
         <w:spacing w:after="120"/>
       </w:pPr>
-      <w:hyperlink w:history="1" r:id="rIdsouwcfcevqrxgunxqu3wv">
+      <w:hyperlink w:history="1" r:id="rIdagxw9jjpjwlbc7s3onjpi">
         <w:r>
           <w:rPr>
             <w:rFonts w:ascii="Calibri" w:cs="Calibri" w:eastAsia="Calibri" w:hAnsi="Calibri"/>
@@ -77,7 +196,7 @@
         </w:rPr>
         <w:t xml:space="preserve">   |   </w:t>
       </w:r>
-      <w:hyperlink w:history="1" r:id="rIdnj2gfqm0aez--d0x9h-p1">
+      <w:hyperlink w:history="1" r:id="rIdu7d_dou6nqsfxff0pht3p">
         <w:r>
           <w:rPr>
             <w:rFonts w:ascii="Calibri" w:cs="Calibri" w:eastAsia="Calibri" w:hAnsi="Calibri"/>
@@ -98,7 +217,7 @@
         </w:rPr>
         <w:t xml:space="preserve">   |   </w:t>
       </w:r>
-      <w:hyperlink w:history="1" r:id="rIdzxxhqbzx69rnavfwls5ns">
+      <w:hyperlink w:history="1" r:id="rId72hy4ykidk_q0ttcxv1eo">
         <w:r>
           <w:rPr>
             <w:rFonts w:ascii="Calibri" w:cs="Calibri" w:eastAsia="Calibri" w:hAnsi="Calibri"/>
@@ -119,7 +238,7 @@
         </w:rPr>
         <w:t xml:space="preserve">   |   </w:t>
       </w:r>
-      <w:hyperlink w:history="1" r:id="rIdvhxjq6b1cwl3afqus2ns6">
+      <w:hyperlink w:history="1" r:id="rIdchfpj1bxmcop_nijwnacg">
         <w:r>
           <w:rPr>
             <w:rFonts w:ascii="Calibri" w:cs="Calibri" w:eastAsia="Calibri" w:hAnsi="Calibri"/>
@@ -160,13 +279,145 @@
       <w:r>
         <w:rPr>
           <w:rFonts w:ascii="Calibri" w:cs="Calibri" w:eastAsia="Calibri" w:hAnsi="Calibri"/>
-          <w:i w:val="false"/>
-          <w:iCs w:val="false"/>
-          <w:color w:val="222222"/>
-          <w:sz w:val="18"/>
-          <w:szCs w:val="18"/>
-        </w:rPr>
-        <w:t xml:space="preserve">Senior Mobile Engineer with 9+ years of commercial experience building scalable, high-performance mobile applications across iOS, Android, Flutter, Kotlin Multiplatform (KMP), Compose Multiplatform (CMP), and React Native. Proven expertise in Swift, SwiftUI, Kotlin, Jetpack Compose, and modern architectures (MVVM, Clean Architecture). Experienced across B2B &amp; B2C telecom, digital signage, fintech, and healthcare domains, working with distributed global teams. Strong focus on performance, maintainability, and clean code.</w:t>
+          <w:b w:val="false"/>
+          <w:bCs w:val="false"/>
+          <w:i w:val="false"/>
+          <w:iCs w:val="false"/>
+          <w:color w:val="222222"/>
+          <w:sz w:val="18"/>
+          <w:szCs w:val="18"/>
+        </w:rPr>
+        <w:t xml:space="preserve">Senior Mobile Engineer with 9+ years of commercial experience building scalable, high-performance mobile applications across </w:t>
+      </w:r>
+      <w:r>
+        <w:rPr>
+          <w:rFonts w:ascii="Calibri" w:cs="Calibri" w:eastAsia="Calibri" w:hAnsi="Calibri"/>
+          <w:b/>
+          <w:bCs/>
+          <w:i w:val="false"/>
+          <w:iCs w:val="false"/>
+          <w:color w:val="1D4ED8"/>
+          <w:sz w:val="18"/>
+          <w:szCs w:val="18"/>
+        </w:rPr>
+        <w:t xml:space="preserve">iOS</w:t>
+      </w:r>
+      <w:r>
+        <w:rPr>
+          <w:rFonts w:ascii="Calibri" w:cs="Calibri" w:eastAsia="Calibri" w:hAnsi="Calibri"/>
+          <w:b w:val="false"/>
+          <w:bCs w:val="false"/>
+          <w:i w:val="false"/>
+          <w:iCs w:val="false"/>
+          <w:color w:val="222222"/>
+          <w:sz w:val="18"/>
+          <w:szCs w:val="18"/>
+        </w:rPr>
+        <w:t xml:space="preserve">, </w:t>
+      </w:r>
+      <w:r>
+        <w:rPr>
+          <w:rFonts w:ascii="Calibri" w:cs="Calibri" w:eastAsia="Calibri" w:hAnsi="Calibri"/>
+          <w:b/>
+          <w:bCs/>
+          <w:i w:val="false"/>
+          <w:iCs w:val="false"/>
+          <w:color w:val="1D4ED8"/>
+          <w:sz w:val="18"/>
+          <w:szCs w:val="18"/>
+        </w:rPr>
+        <w:t xml:space="preserve">Android</w:t>
+      </w:r>
+      <w:r>
+        <w:rPr>
+          <w:rFonts w:ascii="Calibri" w:cs="Calibri" w:eastAsia="Calibri" w:hAnsi="Calibri"/>
+          <w:b w:val="false"/>
+          <w:bCs w:val="false"/>
+          <w:i w:val="false"/>
+          <w:iCs w:val="false"/>
+          <w:color w:val="222222"/>
+          <w:sz w:val="18"/>
+          <w:szCs w:val="18"/>
+        </w:rPr>
+        <w:t xml:space="preserve">, </w:t>
+      </w:r>
+      <w:r>
+        <w:rPr>
+          <w:rFonts w:ascii="Calibri" w:cs="Calibri" w:eastAsia="Calibri" w:hAnsi="Calibri"/>
+          <w:b/>
+          <w:bCs/>
+          <w:i w:val="false"/>
+          <w:iCs w:val="false"/>
+          <w:color w:val="1D4ED8"/>
+          <w:sz w:val="18"/>
+          <w:szCs w:val="18"/>
+        </w:rPr>
+        <w:t xml:space="preserve">Flutter</w:t>
+      </w:r>
+      <w:r>
+        <w:rPr>
+          <w:rFonts w:ascii="Calibri" w:cs="Calibri" w:eastAsia="Calibri" w:hAnsi="Calibri"/>
+          <w:b w:val="false"/>
+          <w:bCs w:val="false"/>
+          <w:i w:val="false"/>
+          <w:iCs w:val="false"/>
+          <w:color w:val="222222"/>
+          <w:sz w:val="18"/>
+          <w:szCs w:val="18"/>
+        </w:rPr>
+        <w:t xml:space="preserve">, Kotlin Multiplatform (</w:t>
+      </w:r>
+      <w:r>
+        <w:rPr>
+          <w:rFonts w:ascii="Calibri" w:cs="Calibri" w:eastAsia="Calibri" w:hAnsi="Calibri"/>
+          <w:b/>
+          <w:bCs/>
+          <w:i w:val="false"/>
+          <w:iCs w:val="false"/>
+          <w:color w:val="1D4ED8"/>
+          <w:sz w:val="18"/>
+          <w:szCs w:val="18"/>
+        </w:rPr>
+        <w:t xml:space="preserve">KMP</w:t>
+      </w:r>
+      <w:r>
+        <w:rPr>
+          <w:rFonts w:ascii="Calibri" w:cs="Calibri" w:eastAsia="Calibri" w:hAnsi="Calibri"/>
+          <w:b w:val="false"/>
+          <w:bCs w:val="false"/>
+          <w:i w:val="false"/>
+          <w:iCs w:val="false"/>
+          <w:color w:val="222222"/>
+          <w:sz w:val="18"/>
+          <w:szCs w:val="18"/>
+        </w:rPr>
+        <w:t xml:space="preserve">), Compose Multiplatform (</w:t>
+      </w:r>
+      <w:r>
+        <w:rPr>
+          <w:rFonts w:ascii="Calibri" w:cs="Calibri" w:eastAsia="Calibri" w:hAnsi="Calibri"/>
+          <w:b/>
+          <w:bCs/>
+          <w:i w:val="false"/>
+          <w:iCs w:val="false"/>
+          <w:color w:val="1D4ED8"/>
+          <w:sz w:val="18"/>
+          <w:szCs w:val="18"/>
+        </w:rPr>
+        <w:t xml:space="preserve">CMP</w:t>
+      </w:r>
+      <w:r>
+        <w:rPr>
+          <w:rFonts w:ascii="Calibri" w:cs="Calibri" w:eastAsia="Calibri" w:hAnsi="Calibri"/>
+          <w:b w:val="false"/>
+          <w:bCs w:val="false"/>
+          <w:i w:val="false"/>
+          <w:iCs w:val="false"/>
+          <w:color w:val="222222"/>
+          <w:sz w:val="18"/>
+          <w:szCs w:val="18"/>
+        </w:rPr>
+        <w:t xml:space="preserve">), and React Native. Proven expertise in Swift, SwiftUI, Kotlin, Jetpack Compose, and modern architectures (MVVM, Clean Architecture). Experienced across B2B &amp; B2C telecom, digital signage, fintech, and healthcare domains, working with distributed global teams. Strong focus on performance, maintainability, and clean code.</w:t>
       </w:r>
     </w:p>
     <w:p>
@@ -203,6 +454,8 @@
           <w:rFonts w:ascii="Calibri" w:cs="Calibri" w:eastAsia="Calibri" w:hAnsi="Calibri"/>
           <w:b/>
           <w:bCs/>
+          <w:i w:val="false"/>
+          <w:iCs w:val="false"/>
           <w:color w:val="222222"/>
           <w:sz w:val="19"/>
           <w:szCs w:val="19"/>
@@ -230,6 +483,8 @@
       <w:r>
         <w:rPr>
           <w:rFonts w:ascii="Calibri" w:cs="Calibri" w:eastAsia="Calibri" w:hAnsi="Calibri"/>
+          <w:b w:val="false"/>
+          <w:bCs w:val="false"/>
           <w:i/>
           <w:iCs/>
           <w:color w:val="555555"/>
@@ -253,11 +508,41 @@
       <w:r>
         <w:rPr>
           <w:rFonts w:ascii="Calibri" w:cs="Calibri" w:eastAsia="Calibri" w:hAnsi="Calibri"/>
-          <w:color w:val="222222"/>
-          <w:sz w:val="18"/>
-          <w:szCs w:val="18"/>
-        </w:rPr>
-        <w:t xml:space="preserve">Mobile application development with Flutter as part of the Apadmi engineering team.</w:t>
+          <w:b w:val="false"/>
+          <w:bCs w:val="false"/>
+          <w:i w:val="false"/>
+          <w:iCs w:val="false"/>
+          <w:color w:val="222222"/>
+          <w:sz w:val="18"/>
+          <w:szCs w:val="18"/>
+        </w:rPr>
+        <w:t xml:space="preserve">Mobile application development with </w:t>
+      </w:r>
+      <w:r>
+        <w:rPr>
+          <w:rFonts w:ascii="Calibri" w:cs="Calibri" w:eastAsia="Calibri" w:hAnsi="Calibri"/>
+          <w:b/>
+          <w:bCs/>
+          <w:i w:val="false"/>
+          <w:iCs w:val="false"/>
+          <w:color w:val="1D4ED8"/>
+          <w:sz w:val="18"/>
+          <w:szCs w:val="18"/>
+        </w:rPr>
+        <w:t xml:space="preserve">Flutter</w:t>
+      </w:r>
+      <w:r>
+        <w:rPr>
+          <w:rFonts w:ascii="Calibri" w:cs="Calibri" w:eastAsia="Calibri" w:hAnsi="Calibri"/>
+          <w:b w:val="false"/>
+          <w:bCs w:val="false"/>
+          <w:i w:val="false"/>
+          <w:iCs w:val="false"/>
+          <w:color w:val="222222"/>
+          <w:sz w:val="18"/>
+          <w:szCs w:val="18"/>
+        </w:rPr>
+        <w:t xml:space="preserve"> as part of the Apadmi engineering team.</w:t>
       </w:r>
     </w:p>
     <w:p>
@@ -274,11 +559,91 @@
           <w:rFonts w:ascii="Calibri" w:cs="Calibri" w:eastAsia="Calibri" w:hAnsi="Calibri"/>
           <w:b/>
           <w:bCs/>
+          <w:i w:val="false"/>
+          <w:iCs w:val="false"/>
           <w:color w:val="222222"/>
           <w:sz w:val="19"/>
           <w:szCs w:val="19"/>
         </w:rPr>
-        <w:t xml:space="preserve">Platform Lead — iOS, Android, KMP — Digmi AB (via Lucytech)</w:t>
+        <w:t xml:space="preserve">Platform Lead — </w:t>
+      </w:r>
+      <w:r>
+        <w:rPr>
+          <w:rFonts w:ascii="Calibri" w:cs="Calibri" w:eastAsia="Calibri" w:hAnsi="Calibri"/>
+          <w:b/>
+          <w:bCs/>
+          <w:i w:val="false"/>
+          <w:iCs w:val="false"/>
+          <w:color w:val="1D4ED8"/>
+          <w:sz w:val="19"/>
+          <w:szCs w:val="19"/>
+        </w:rPr>
+        <w:t xml:space="preserve">iOS</w:t>
+      </w:r>
+      <w:r>
+        <w:rPr>
+          <w:rFonts w:ascii="Calibri" w:cs="Calibri" w:eastAsia="Calibri" w:hAnsi="Calibri"/>
+          <w:b/>
+          <w:bCs/>
+          <w:i w:val="false"/>
+          <w:iCs w:val="false"/>
+          <w:color w:val="222222"/>
+          <w:sz w:val="19"/>
+          <w:szCs w:val="19"/>
+        </w:rPr>
+        <w:t xml:space="preserve">, </w:t>
+      </w:r>
+      <w:r>
+        <w:rPr>
+          <w:rFonts w:ascii="Calibri" w:cs="Calibri" w:eastAsia="Calibri" w:hAnsi="Calibri"/>
+          <w:b/>
+          <w:bCs/>
+          <w:i w:val="false"/>
+          <w:iCs w:val="false"/>
+          <w:color w:val="1D4ED8"/>
+          <w:sz w:val="19"/>
+          <w:szCs w:val="19"/>
+        </w:rPr>
+        <w:t xml:space="preserve">Android</w:t>
+      </w:r>
+      <w:r>
+        <w:rPr>
+          <w:rFonts w:ascii="Calibri" w:cs="Calibri" w:eastAsia="Calibri" w:hAnsi="Calibri"/>
+          <w:b/>
+          <w:bCs/>
+          <w:i w:val="false"/>
+          <w:iCs w:val="false"/>
+          <w:color w:val="222222"/>
+          <w:sz w:val="19"/>
+          <w:szCs w:val="19"/>
+        </w:rPr>
+        <w:t xml:space="preserve">, </w:t>
+      </w:r>
+      <w:r>
+        <w:rPr>
+          <w:rFonts w:ascii="Calibri" w:cs="Calibri" w:eastAsia="Calibri" w:hAnsi="Calibri"/>
+          <w:b/>
+          <w:bCs/>
+          <w:i w:val="false"/>
+          <w:iCs w:val="false"/>
+          <w:color w:val="1D4ED8"/>
+          <w:sz w:val="19"/>
+          <w:szCs w:val="19"/>
+        </w:rPr>
+        <w:t xml:space="preserve">KMP</w:t>
+      </w:r>
+      <w:r>
+        <w:rPr>
+          <w:rFonts w:ascii="Calibri" w:cs="Calibri" w:eastAsia="Calibri" w:hAnsi="Calibri"/>
+          <w:b/>
+          <w:bCs/>
+          <w:i w:val="false"/>
+          <w:iCs w:val="false"/>
+          <w:color w:val="222222"/>
+          <w:sz w:val="19"/>
+          <w:szCs w:val="19"/>
+        </w:rPr>
+        <w:t xml:space="preserve"> — Digmi AB (via Lucytech)</w:t>
       </w:r>
       <w:r>
         <w:rPr>
@@ -301,6 +666,8 @@
       <w:r>
         <w:rPr>
           <w:rFonts w:ascii="Calibri" w:cs="Calibri" w:eastAsia="Calibri" w:hAnsi="Calibri"/>
+          <w:b w:val="false"/>
+          <w:bCs w:val="false"/>
           <w:i/>
           <w:iCs/>
           <w:color w:val="555555"/>
@@ -324,11 +691,67 @@
       <w:r>
         <w:rPr>
           <w:rFonts w:ascii="Calibri" w:cs="Calibri" w:eastAsia="Calibri" w:hAnsi="Calibri"/>
-          <w:color w:val="222222"/>
-          <w:sz w:val="18"/>
-          <w:szCs w:val="18"/>
-        </w:rPr>
-        <w:t xml:space="preserve">Led the mobile engineering strategy and architecture for the Digmi ecosystem, focusing on Android and iOS platforms.</w:t>
+          <w:b w:val="false"/>
+          <w:bCs w:val="false"/>
+          <w:i w:val="false"/>
+          <w:iCs w:val="false"/>
+          <w:color w:val="222222"/>
+          <w:sz w:val="18"/>
+          <w:szCs w:val="18"/>
+        </w:rPr>
+        <w:t xml:space="preserve">Led the mobile engineering strategy and architecture for the Digmi ecosystem, focusing on </w:t>
+      </w:r>
+      <w:r>
+        <w:rPr>
+          <w:rFonts w:ascii="Calibri" w:cs="Calibri" w:eastAsia="Calibri" w:hAnsi="Calibri"/>
+          <w:b/>
+          <w:bCs/>
+          <w:i w:val="false"/>
+          <w:iCs w:val="false"/>
+          <w:color w:val="1D4ED8"/>
+          <w:sz w:val="18"/>
+          <w:szCs w:val="18"/>
+        </w:rPr>
+        <w:t xml:space="preserve">Android</w:t>
+      </w:r>
+      <w:r>
+        <w:rPr>
+          <w:rFonts w:ascii="Calibri" w:cs="Calibri" w:eastAsia="Calibri" w:hAnsi="Calibri"/>
+          <w:b w:val="false"/>
+          <w:bCs w:val="false"/>
+          <w:i w:val="false"/>
+          <w:iCs w:val="false"/>
+          <w:color w:val="222222"/>
+          <w:sz w:val="18"/>
+          <w:szCs w:val="18"/>
+        </w:rPr>
+        <w:t xml:space="preserve"> and </w:t>
+      </w:r>
+      <w:r>
+        <w:rPr>
+          <w:rFonts w:ascii="Calibri" w:cs="Calibri" w:eastAsia="Calibri" w:hAnsi="Calibri"/>
+          <w:b/>
+          <w:bCs/>
+          <w:i w:val="false"/>
+          <w:iCs w:val="false"/>
+          <w:color w:val="1D4ED8"/>
+          <w:sz w:val="18"/>
+          <w:szCs w:val="18"/>
+        </w:rPr>
+        <w:t xml:space="preserve">iOS</w:t>
+      </w:r>
+      <w:r>
+        <w:rPr>
+          <w:rFonts w:ascii="Calibri" w:cs="Calibri" w:eastAsia="Calibri" w:hAnsi="Calibri"/>
+          <w:b w:val="false"/>
+          <w:bCs w:val="false"/>
+          <w:i w:val="false"/>
+          <w:iCs w:val="false"/>
+          <w:color w:val="222222"/>
+          <w:sz w:val="18"/>
+          <w:szCs w:val="18"/>
+        </w:rPr>
+        <w:t xml:space="preserve"> platforms.</w:t>
       </w:r>
     </w:p>
     <w:p>
@@ -345,6 +768,10 @@
       <w:r>
         <w:rPr>
           <w:rFonts w:ascii="Calibri" w:cs="Calibri" w:eastAsia="Calibri" w:hAnsi="Calibri"/>
+          <w:b w:val="false"/>
+          <w:bCs w:val="false"/>
+          <w:i w:val="false"/>
+          <w:iCs w:val="false"/>
           <w:color w:val="222222"/>
           <w:sz w:val="18"/>
           <w:szCs w:val="18"/>
@@ -366,6 +793,10 @@
       <w:r>
         <w:rPr>
           <w:rFonts w:ascii="Calibri" w:cs="Calibri" w:eastAsia="Calibri" w:hAnsi="Calibri"/>
+          <w:b w:val="false"/>
+          <w:bCs w:val="false"/>
+          <w:i w:val="false"/>
+          <w:iCs w:val="false"/>
           <w:color w:val="222222"/>
           <w:sz w:val="18"/>
           <w:szCs w:val="18"/>
@@ -387,11 +818,41 @@
       <w:r>
         <w:rPr>
           <w:rFonts w:ascii="Calibri" w:cs="Calibri" w:eastAsia="Calibri" w:hAnsi="Calibri"/>
-          <w:color w:val="222222"/>
-          <w:sz w:val="18"/>
-          <w:szCs w:val="18"/>
-        </w:rPr>
-        <w:t xml:space="preserve">Established modern development standards using SwiftUI, Kotlin, and KMP, driving CI/CD automation.</w:t>
+          <w:b w:val="false"/>
+          <w:bCs w:val="false"/>
+          <w:i w:val="false"/>
+          <w:iCs w:val="false"/>
+          <w:color w:val="222222"/>
+          <w:sz w:val="18"/>
+          <w:szCs w:val="18"/>
+        </w:rPr>
+        <w:t xml:space="preserve">Established modern development standards using SwiftUI, Kotlin, and </w:t>
+      </w:r>
+      <w:r>
+        <w:rPr>
+          <w:rFonts w:ascii="Calibri" w:cs="Calibri" w:eastAsia="Calibri" w:hAnsi="Calibri"/>
+          <w:b/>
+          <w:bCs/>
+          <w:i w:val="false"/>
+          <w:iCs w:val="false"/>
+          <w:color w:val="1D4ED8"/>
+          <w:sz w:val="18"/>
+          <w:szCs w:val="18"/>
+        </w:rPr>
+        <w:t xml:space="preserve">KMP</w:t>
+      </w:r>
+      <w:r>
+        <w:rPr>
+          <w:rFonts w:ascii="Calibri" w:cs="Calibri" w:eastAsia="Calibri" w:hAnsi="Calibri"/>
+          <w:b w:val="false"/>
+          <w:bCs w:val="false"/>
+          <w:i w:val="false"/>
+          <w:iCs w:val="false"/>
+          <w:color w:val="222222"/>
+          <w:sz w:val="18"/>
+          <w:szCs w:val="18"/>
+        </w:rPr>
+        <w:t xml:space="preserve">, driving CI/CD automation.</w:t>
       </w:r>
     </w:p>
     <w:p>
@@ -408,11 +869,65 @@
           <w:rFonts w:ascii="Calibri" w:cs="Calibri" w:eastAsia="Calibri" w:hAnsi="Calibri"/>
           <w:b/>
           <w:bCs/>
+          <w:i w:val="false"/>
+          <w:iCs w:val="false"/>
           <w:color w:val="222222"/>
           <w:sz w:val="19"/>
           <w:szCs w:val="19"/>
         </w:rPr>
-        <w:t xml:space="preserve">Senior Software Engineer — iOS, Android (Contract) — Zone24x7</w:t>
+        <w:t xml:space="preserve">Senior Software Engineer — </w:t>
+      </w:r>
+      <w:r>
+        <w:rPr>
+          <w:rFonts w:ascii="Calibri" w:cs="Calibri" w:eastAsia="Calibri" w:hAnsi="Calibri"/>
+          <w:b/>
+          <w:bCs/>
+          <w:i w:val="false"/>
+          <w:iCs w:val="false"/>
+          <w:color w:val="1D4ED8"/>
+          <w:sz w:val="19"/>
+          <w:szCs w:val="19"/>
+        </w:rPr>
+        <w:t xml:space="preserve">iOS</w:t>
+      </w:r>
+      <w:r>
+        <w:rPr>
+          <w:rFonts w:ascii="Calibri" w:cs="Calibri" w:eastAsia="Calibri" w:hAnsi="Calibri"/>
+          <w:b/>
+          <w:bCs/>
+          <w:i w:val="false"/>
+          <w:iCs w:val="false"/>
+          <w:color w:val="222222"/>
+          <w:sz w:val="19"/>
+          <w:szCs w:val="19"/>
+        </w:rPr>
+        <w:t xml:space="preserve">, </w:t>
+      </w:r>
+      <w:r>
+        <w:rPr>
+          <w:rFonts w:ascii="Calibri" w:cs="Calibri" w:eastAsia="Calibri" w:hAnsi="Calibri"/>
+          <w:b/>
+          <w:bCs/>
+          <w:i w:val="false"/>
+          <w:iCs w:val="false"/>
+          <w:color w:val="1D4ED8"/>
+          <w:sz w:val="19"/>
+          <w:szCs w:val="19"/>
+        </w:rPr>
+        <w:t xml:space="preserve">Android</w:t>
+      </w:r>
+      <w:r>
+        <w:rPr>
+          <w:rFonts w:ascii="Calibri" w:cs="Calibri" w:eastAsia="Calibri" w:hAnsi="Calibri"/>
+          <w:b/>
+          <w:bCs/>
+          <w:i w:val="false"/>
+          <w:iCs w:val="false"/>
+          <w:color w:val="222222"/>
+          <w:sz w:val="19"/>
+          <w:szCs w:val="19"/>
+        </w:rPr>
+        <w:t xml:space="preserve"> (Contract) — Zone24x7</w:t>
       </w:r>
       <w:r>
         <w:rPr>
@@ -435,6 +950,8 @@
       <w:r>
         <w:rPr>
           <w:rFonts w:ascii="Calibri" w:cs="Calibri" w:eastAsia="Calibri" w:hAnsi="Calibri"/>
+          <w:b w:val="false"/>
+          <w:bCs w:val="false"/>
           <w:i/>
           <w:iCs/>
           <w:color w:val="555555"/>
@@ -458,6 +975,10 @@
       <w:r>
         <w:rPr>
           <w:rFonts w:ascii="Calibri" w:cs="Calibri" w:eastAsia="Calibri" w:hAnsi="Calibri"/>
+          <w:b w:val="false"/>
+          <w:bCs w:val="false"/>
+          <w:i w:val="false"/>
+          <w:iCs w:val="false"/>
           <w:color w:val="222222"/>
           <w:sz w:val="18"/>
           <w:szCs w:val="18"/>
@@ -479,11 +1000,41 @@
       <w:r>
         <w:rPr>
           <w:rFonts w:ascii="Calibri" w:cs="Calibri" w:eastAsia="Calibri" w:hAnsi="Calibri"/>
-          <w:color w:val="222222"/>
-          <w:sz w:val="18"/>
-          <w:szCs w:val="18"/>
-        </w:rPr>
-        <w:t xml:space="preserve">Implemented new features for the AT&amp;T iOS app.</w:t>
+          <w:b w:val="false"/>
+          <w:bCs w:val="false"/>
+          <w:i w:val="false"/>
+          <w:iCs w:val="false"/>
+          <w:color w:val="222222"/>
+          <w:sz w:val="18"/>
+          <w:szCs w:val="18"/>
+        </w:rPr>
+        <w:t xml:space="preserve">Implemented new features for the AT&amp;T </w:t>
+      </w:r>
+      <w:r>
+        <w:rPr>
+          <w:rFonts w:ascii="Calibri" w:cs="Calibri" w:eastAsia="Calibri" w:hAnsi="Calibri"/>
+          <w:b/>
+          <w:bCs/>
+          <w:i w:val="false"/>
+          <w:iCs w:val="false"/>
+          <w:color w:val="1D4ED8"/>
+          <w:sz w:val="18"/>
+          <w:szCs w:val="18"/>
+        </w:rPr>
+        <w:t xml:space="preserve">iOS</w:t>
+      </w:r>
+      <w:r>
+        <w:rPr>
+          <w:rFonts w:ascii="Calibri" w:cs="Calibri" w:eastAsia="Calibri" w:hAnsi="Calibri"/>
+          <w:b w:val="false"/>
+          <w:bCs w:val="false"/>
+          <w:i w:val="false"/>
+          <w:iCs w:val="false"/>
+          <w:color w:val="222222"/>
+          <w:sz w:val="18"/>
+          <w:szCs w:val="18"/>
+        </w:rPr>
+        <w:t xml:space="preserve"> app.</w:t>
       </w:r>
     </w:p>
     <w:p>
@@ -500,11 +1051,39 @@
           <w:rFonts w:ascii="Calibri" w:cs="Calibri" w:eastAsia="Calibri" w:hAnsi="Calibri"/>
           <w:b/>
           <w:bCs/>
+          <w:i w:val="false"/>
+          <w:iCs w:val="false"/>
           <w:color w:val="222222"/>
           <w:sz w:val="19"/>
           <w:szCs w:val="19"/>
         </w:rPr>
-        <w:t xml:space="preserve">Senior Software Engineer — iOS (Contract) — Circles</w:t>
+        <w:t xml:space="preserve">Senior Software Engineer — </w:t>
+      </w:r>
+      <w:r>
+        <w:rPr>
+          <w:rFonts w:ascii="Calibri" w:cs="Calibri" w:eastAsia="Calibri" w:hAnsi="Calibri"/>
+          <w:b/>
+          <w:bCs/>
+          <w:i w:val="false"/>
+          <w:iCs w:val="false"/>
+          <w:color w:val="1D4ED8"/>
+          <w:sz w:val="19"/>
+          <w:szCs w:val="19"/>
+        </w:rPr>
+        <w:t xml:space="preserve">iOS</w:t>
+      </w:r>
+      <w:r>
+        <w:rPr>
+          <w:rFonts w:ascii="Calibri" w:cs="Calibri" w:eastAsia="Calibri" w:hAnsi="Calibri"/>
+          <w:b/>
+          <w:bCs/>
+          <w:i w:val="false"/>
+          <w:iCs w:val="false"/>
+          <w:color w:val="222222"/>
+          <w:sz w:val="19"/>
+          <w:szCs w:val="19"/>
+        </w:rPr>
+        <w:t xml:space="preserve"> (Contract) — Circles</w:t>
       </w:r>
       <w:r>
         <w:rPr>
@@ -527,6 +1106,8 @@
       <w:r>
         <w:rPr>
           <w:rFonts w:ascii="Calibri" w:cs="Calibri" w:eastAsia="Calibri" w:hAnsi="Calibri"/>
+          <w:b w:val="false"/>
+          <w:bCs w:val="false"/>
           <w:i/>
           <w:iCs/>
           <w:color w:val="555555"/>
@@ -550,11 +1131,41 @@
       <w:r>
         <w:rPr>
           <w:rFonts w:ascii="Calibri" w:cs="Calibri" w:eastAsia="Calibri" w:hAnsi="Calibri"/>
-          <w:color w:val="222222"/>
-          <w:sz w:val="18"/>
-          <w:szCs w:val="18"/>
-        </w:rPr>
-        <w:t xml:space="preserve">Implemented new features for the ANP iOS app.</w:t>
+          <w:b w:val="false"/>
+          <w:bCs w:val="false"/>
+          <w:i w:val="false"/>
+          <w:iCs w:val="false"/>
+          <w:color w:val="222222"/>
+          <w:sz w:val="18"/>
+          <w:szCs w:val="18"/>
+        </w:rPr>
+        <w:t xml:space="preserve">Implemented new features for the ANP </w:t>
+      </w:r>
+      <w:r>
+        <w:rPr>
+          <w:rFonts w:ascii="Calibri" w:cs="Calibri" w:eastAsia="Calibri" w:hAnsi="Calibri"/>
+          <w:b/>
+          <w:bCs/>
+          <w:i w:val="false"/>
+          <w:iCs w:val="false"/>
+          <w:color w:val="1D4ED8"/>
+          <w:sz w:val="18"/>
+          <w:szCs w:val="18"/>
+        </w:rPr>
+        <w:t xml:space="preserve">iOS</w:t>
+      </w:r>
+      <w:r>
+        <w:rPr>
+          <w:rFonts w:ascii="Calibri" w:cs="Calibri" w:eastAsia="Calibri" w:hAnsi="Calibri"/>
+          <w:b w:val="false"/>
+          <w:bCs w:val="false"/>
+          <w:i w:val="false"/>
+          <w:iCs w:val="false"/>
+          <w:color w:val="222222"/>
+          <w:sz w:val="18"/>
+          <w:szCs w:val="18"/>
+        </w:rPr>
+        <w:t xml:space="preserve"> app.</w:t>
       </w:r>
     </w:p>
     <w:p>
@@ -571,11 +1182,65 @@
           <w:rFonts w:ascii="Calibri" w:cs="Calibri" w:eastAsia="Calibri" w:hAnsi="Calibri"/>
           <w:b/>
           <w:bCs/>
+          <w:i w:val="false"/>
+          <w:iCs w:val="false"/>
           <w:color w:val="222222"/>
           <w:sz w:val="19"/>
           <w:szCs w:val="19"/>
         </w:rPr>
-        <w:t xml:space="preserve">Senior Software Engineer — iOS, Android — Doc990 (Dialog Axiata PLC)</w:t>
+        <w:t xml:space="preserve">Senior Software Engineer — </w:t>
+      </w:r>
+      <w:r>
+        <w:rPr>
+          <w:rFonts w:ascii="Calibri" w:cs="Calibri" w:eastAsia="Calibri" w:hAnsi="Calibri"/>
+          <w:b/>
+          <w:bCs/>
+          <w:i w:val="false"/>
+          <w:iCs w:val="false"/>
+          <w:color w:val="1D4ED8"/>
+          <w:sz w:val="19"/>
+          <w:szCs w:val="19"/>
+        </w:rPr>
+        <w:t xml:space="preserve">iOS</w:t>
+      </w:r>
+      <w:r>
+        <w:rPr>
+          <w:rFonts w:ascii="Calibri" w:cs="Calibri" w:eastAsia="Calibri" w:hAnsi="Calibri"/>
+          <w:b/>
+          <w:bCs/>
+          <w:i w:val="false"/>
+          <w:iCs w:val="false"/>
+          <w:color w:val="222222"/>
+          <w:sz w:val="19"/>
+          <w:szCs w:val="19"/>
+        </w:rPr>
+        <w:t xml:space="preserve">, </w:t>
+      </w:r>
+      <w:r>
+        <w:rPr>
+          <w:rFonts w:ascii="Calibri" w:cs="Calibri" w:eastAsia="Calibri" w:hAnsi="Calibri"/>
+          <w:b/>
+          <w:bCs/>
+          <w:i w:val="false"/>
+          <w:iCs w:val="false"/>
+          <w:color w:val="1D4ED8"/>
+          <w:sz w:val="19"/>
+          <w:szCs w:val="19"/>
+        </w:rPr>
+        <w:t xml:space="preserve">Android</w:t>
+      </w:r>
+      <w:r>
+        <w:rPr>
+          <w:rFonts w:ascii="Calibri" w:cs="Calibri" w:eastAsia="Calibri" w:hAnsi="Calibri"/>
+          <w:b/>
+          <w:bCs/>
+          <w:i w:val="false"/>
+          <w:iCs w:val="false"/>
+          <w:color w:val="222222"/>
+          <w:sz w:val="19"/>
+          <w:szCs w:val="19"/>
+        </w:rPr>
+        <w:t xml:space="preserve"> — Doc990 (Dialog Axiata PLC)</w:t>
       </w:r>
       <w:r>
         <w:rPr>
@@ -598,6 +1263,8 @@
       <w:r>
         <w:rPr>
           <w:rFonts w:ascii="Calibri" w:cs="Calibri" w:eastAsia="Calibri" w:hAnsi="Calibri"/>
+          <w:b w:val="false"/>
+          <w:bCs w:val="false"/>
           <w:i/>
           <w:iCs/>
           <w:color w:val="555555"/>
@@ -621,6 +1288,10 @@
       <w:r>
         <w:rPr>
           <w:rFonts w:ascii="Calibri" w:cs="Calibri" w:eastAsia="Calibri" w:hAnsi="Calibri"/>
+          <w:b w:val="false"/>
+          <w:bCs w:val="false"/>
+          <w:i w:val="false"/>
+          <w:iCs w:val="false"/>
           <w:color w:val="222222"/>
           <w:sz w:val="18"/>
           <w:szCs w:val="18"/>
@@ -642,6 +1313,10 @@
       <w:r>
         <w:rPr>
           <w:rFonts w:ascii="Calibri" w:cs="Calibri" w:eastAsia="Calibri" w:hAnsi="Calibri"/>
+          <w:b w:val="false"/>
+          <w:bCs w:val="false"/>
+          <w:i w:val="false"/>
+          <w:iCs w:val="false"/>
           <w:color w:val="222222"/>
           <w:sz w:val="18"/>
           <w:szCs w:val="18"/>
@@ -663,11 +1338,65 @@
           <w:rFonts w:ascii="Calibri" w:cs="Calibri" w:eastAsia="Calibri" w:hAnsi="Calibri"/>
           <w:b/>
           <w:bCs/>
+          <w:i w:val="false"/>
+          <w:iCs w:val="false"/>
           <w:color w:val="222222"/>
           <w:sz w:val="19"/>
           <w:szCs w:val="19"/>
         </w:rPr>
-        <w:t xml:space="preserve">Software Engineer — iOS, Android — Doc990 (Dialog Axiata PLC)</w:t>
+        <w:t xml:space="preserve">Software Engineer — </w:t>
+      </w:r>
+      <w:r>
+        <w:rPr>
+          <w:rFonts w:ascii="Calibri" w:cs="Calibri" w:eastAsia="Calibri" w:hAnsi="Calibri"/>
+          <w:b/>
+          <w:bCs/>
+          <w:i w:val="false"/>
+          <w:iCs w:val="false"/>
+          <w:color w:val="1D4ED8"/>
+          <w:sz w:val="19"/>
+          <w:szCs w:val="19"/>
+        </w:rPr>
+        <w:t xml:space="preserve">iOS</w:t>
+      </w:r>
+      <w:r>
+        <w:rPr>
+          <w:rFonts w:ascii="Calibri" w:cs="Calibri" w:eastAsia="Calibri" w:hAnsi="Calibri"/>
+          <w:b/>
+          <w:bCs/>
+          <w:i w:val="false"/>
+          <w:iCs w:val="false"/>
+          <w:color w:val="222222"/>
+          <w:sz w:val="19"/>
+          <w:szCs w:val="19"/>
+        </w:rPr>
+        <w:t xml:space="preserve">, </w:t>
+      </w:r>
+      <w:r>
+        <w:rPr>
+          <w:rFonts w:ascii="Calibri" w:cs="Calibri" w:eastAsia="Calibri" w:hAnsi="Calibri"/>
+          <w:b/>
+          <w:bCs/>
+          <w:i w:val="false"/>
+          <w:iCs w:val="false"/>
+          <w:color w:val="1D4ED8"/>
+          <w:sz w:val="19"/>
+          <w:szCs w:val="19"/>
+        </w:rPr>
+        <w:t xml:space="preserve">Android</w:t>
+      </w:r>
+      <w:r>
+        <w:rPr>
+          <w:rFonts w:ascii="Calibri" w:cs="Calibri" w:eastAsia="Calibri" w:hAnsi="Calibri"/>
+          <w:b/>
+          <w:bCs/>
+          <w:i w:val="false"/>
+          <w:iCs w:val="false"/>
+          <w:color w:val="222222"/>
+          <w:sz w:val="19"/>
+          <w:szCs w:val="19"/>
+        </w:rPr>
+        <w:t xml:space="preserve"> — Doc990 (Dialog Axiata PLC)</w:t>
       </w:r>
       <w:r>
         <w:rPr>
@@ -690,6 +1419,8 @@
       <w:r>
         <w:rPr>
           <w:rFonts w:ascii="Calibri" w:cs="Calibri" w:eastAsia="Calibri" w:hAnsi="Calibri"/>
+          <w:b w:val="false"/>
+          <w:bCs w:val="false"/>
           <w:i/>
           <w:iCs/>
           <w:color w:val="555555"/>
@@ -713,11 +1444,67 @@
       <w:r>
         <w:rPr>
           <w:rFonts w:ascii="Calibri" w:cs="Calibri" w:eastAsia="Calibri" w:hAnsi="Calibri"/>
-          <w:color w:val="222222"/>
-          <w:sz w:val="18"/>
-          <w:szCs w:val="18"/>
-        </w:rPr>
-        <w:t xml:space="preserve">Built and maintained features for the Doc990 iOS and Android apps.</w:t>
+          <w:b w:val="false"/>
+          <w:bCs w:val="false"/>
+          <w:i w:val="false"/>
+          <w:iCs w:val="false"/>
+          <w:color w:val="222222"/>
+          <w:sz w:val="18"/>
+          <w:szCs w:val="18"/>
+        </w:rPr>
+        <w:t xml:space="preserve">Built and maintained features for the Doc990 </w:t>
+      </w:r>
+      <w:r>
+        <w:rPr>
+          <w:rFonts w:ascii="Calibri" w:cs="Calibri" w:eastAsia="Calibri" w:hAnsi="Calibri"/>
+          <w:b/>
+          <w:bCs/>
+          <w:i w:val="false"/>
+          <w:iCs w:val="false"/>
+          <w:color w:val="1D4ED8"/>
+          <w:sz w:val="18"/>
+          <w:szCs w:val="18"/>
+        </w:rPr>
+        <w:t xml:space="preserve">iOS</w:t>
+      </w:r>
+      <w:r>
+        <w:rPr>
+          <w:rFonts w:ascii="Calibri" w:cs="Calibri" w:eastAsia="Calibri" w:hAnsi="Calibri"/>
+          <w:b w:val="false"/>
+          <w:bCs w:val="false"/>
+          <w:i w:val="false"/>
+          <w:iCs w:val="false"/>
+          <w:color w:val="222222"/>
+          <w:sz w:val="18"/>
+          <w:szCs w:val="18"/>
+        </w:rPr>
+        <w:t xml:space="preserve"> and </w:t>
+      </w:r>
+      <w:r>
+        <w:rPr>
+          <w:rFonts w:ascii="Calibri" w:cs="Calibri" w:eastAsia="Calibri" w:hAnsi="Calibri"/>
+          <w:b/>
+          <w:bCs/>
+          <w:i w:val="false"/>
+          <w:iCs w:val="false"/>
+          <w:color w:val="1D4ED8"/>
+          <w:sz w:val="18"/>
+          <w:szCs w:val="18"/>
+        </w:rPr>
+        <w:t xml:space="preserve">Android</w:t>
+      </w:r>
+      <w:r>
+        <w:rPr>
+          <w:rFonts w:ascii="Calibri" w:cs="Calibri" w:eastAsia="Calibri" w:hAnsi="Calibri"/>
+          <w:b w:val="false"/>
+          <w:bCs w:val="false"/>
+          <w:i w:val="false"/>
+          <w:iCs w:val="false"/>
+          <w:color w:val="222222"/>
+          <w:sz w:val="18"/>
+          <w:szCs w:val="18"/>
+        </w:rPr>
+        <w:t xml:space="preserve"> apps.</w:t>
       </w:r>
     </w:p>
     <w:p>
@@ -734,6 +1521,10 @@
       <w:r>
         <w:rPr>
           <w:rFonts w:ascii="Calibri" w:cs="Calibri" w:eastAsia="Calibri" w:hAnsi="Calibri"/>
+          <w:b w:val="false"/>
+          <w:bCs w:val="false"/>
+          <w:i w:val="false"/>
+          <w:iCs w:val="false"/>
           <w:color w:val="222222"/>
           <w:sz w:val="18"/>
           <w:szCs w:val="18"/>
@@ -755,6 +1546,8 @@
           <w:rFonts w:ascii="Calibri" w:cs="Calibri" w:eastAsia="Calibri" w:hAnsi="Calibri"/>
           <w:b/>
           <w:bCs/>
+          <w:i w:val="false"/>
+          <w:iCs w:val="false"/>
           <w:color w:val="222222"/>
           <w:sz w:val="19"/>
           <w:szCs w:val="19"/>
@@ -782,6 +1575,8 @@
       <w:r>
         <w:rPr>
           <w:rFonts w:ascii="Calibri" w:cs="Calibri" w:eastAsia="Calibri" w:hAnsi="Calibri"/>
+          <w:b w:val="false"/>
+          <w:bCs w:val="false"/>
           <w:i/>
           <w:iCs/>
           <w:color w:val="555555"/>
@@ -805,6 +1600,10 @@
       <w:r>
         <w:rPr>
           <w:rFonts w:ascii="Calibri" w:cs="Calibri" w:eastAsia="Calibri" w:hAnsi="Calibri"/>
+          <w:b w:val="false"/>
+          <w:bCs w:val="false"/>
+          <w:i w:val="false"/>
+          <w:iCs w:val="false"/>
           <w:color w:val="222222"/>
           <w:sz w:val="18"/>
           <w:szCs w:val="18"/>
@@ -826,6 +1625,10 @@
       <w:r>
         <w:rPr>
           <w:rFonts w:ascii="Calibri" w:cs="Calibri" w:eastAsia="Calibri" w:hAnsi="Calibri"/>
+          <w:b w:val="false"/>
+          <w:bCs w:val="false"/>
+          <w:i w:val="false"/>
+          <w:iCs w:val="false"/>
           <w:color w:val="222222"/>
           <w:sz w:val="18"/>
           <w:szCs w:val="18"/>
@@ -847,6 +1650,10 @@
       <w:r>
         <w:rPr>
           <w:rFonts w:ascii="Calibri" w:cs="Calibri" w:eastAsia="Calibri" w:hAnsi="Calibri"/>
+          <w:b w:val="false"/>
+          <w:bCs w:val="false"/>
+          <w:i w:val="false"/>
+          <w:iCs w:val="false"/>
           <w:color w:val="222222"/>
           <w:sz w:val="18"/>
           <w:szCs w:val="18"/>
@@ -868,11 +1675,39 @@
           <w:rFonts w:ascii="Calibri" w:cs="Calibri" w:eastAsia="Calibri" w:hAnsi="Calibri"/>
           <w:b/>
           <w:bCs/>
+          <w:i w:val="false"/>
+          <w:iCs w:val="false"/>
           <w:color w:val="222222"/>
           <w:sz w:val="19"/>
           <w:szCs w:val="19"/>
         </w:rPr>
-        <w:t xml:space="preserve">Software Engineer — Android, React Native — LiveRoom (Pvt) Ltd</w:t>
+        <w:t xml:space="preserve">Software Engineer — </w:t>
+      </w:r>
+      <w:r>
+        <w:rPr>
+          <w:rFonts w:ascii="Calibri" w:cs="Calibri" w:eastAsia="Calibri" w:hAnsi="Calibri"/>
+          <w:b/>
+          <w:bCs/>
+          <w:i w:val="false"/>
+          <w:iCs w:val="false"/>
+          <w:color w:val="1D4ED8"/>
+          <w:sz w:val="19"/>
+          <w:szCs w:val="19"/>
+        </w:rPr>
+        <w:t xml:space="preserve">Android</w:t>
+      </w:r>
+      <w:r>
+        <w:rPr>
+          <w:rFonts w:ascii="Calibri" w:cs="Calibri" w:eastAsia="Calibri" w:hAnsi="Calibri"/>
+          <w:b/>
+          <w:bCs/>
+          <w:i w:val="false"/>
+          <w:iCs w:val="false"/>
+          <w:color w:val="222222"/>
+          <w:sz w:val="19"/>
+          <w:szCs w:val="19"/>
+        </w:rPr>
+        <w:t xml:space="preserve">, React Native — LiveRoom (Pvt) Ltd</w:t>
       </w:r>
       <w:r>
         <w:rPr>
@@ -900,11 +1735,41 @@
       <w:r>
         <w:rPr>
           <w:rFonts w:ascii="Calibri" w:cs="Calibri" w:eastAsia="Calibri" w:hAnsi="Calibri"/>
-          <w:color w:val="222222"/>
-          <w:sz w:val="18"/>
-          <w:szCs w:val="18"/>
-        </w:rPr>
-        <w:t xml:space="preserve">Developed and enhanced the Ackcio Nimbus Android app for configuring Ackcio Beam devices.</w:t>
+          <w:b w:val="false"/>
+          <w:bCs w:val="false"/>
+          <w:i w:val="false"/>
+          <w:iCs w:val="false"/>
+          <w:color w:val="222222"/>
+          <w:sz w:val="18"/>
+          <w:szCs w:val="18"/>
+        </w:rPr>
+        <w:t xml:space="preserve">Developed and enhanced the Ackcio Nimbus </w:t>
+      </w:r>
+      <w:r>
+        <w:rPr>
+          <w:rFonts w:ascii="Calibri" w:cs="Calibri" w:eastAsia="Calibri" w:hAnsi="Calibri"/>
+          <w:b/>
+          <w:bCs/>
+          <w:i w:val="false"/>
+          <w:iCs w:val="false"/>
+          <w:color w:val="1D4ED8"/>
+          <w:sz w:val="18"/>
+          <w:szCs w:val="18"/>
+        </w:rPr>
+        <w:t xml:space="preserve">Android</w:t>
+      </w:r>
+      <w:r>
+        <w:rPr>
+          <w:rFonts w:ascii="Calibri" w:cs="Calibri" w:eastAsia="Calibri" w:hAnsi="Calibri"/>
+          <w:b w:val="false"/>
+          <w:bCs w:val="false"/>
+          <w:i w:val="false"/>
+          <w:iCs w:val="false"/>
+          <w:color w:val="222222"/>
+          <w:sz w:val="18"/>
+          <w:szCs w:val="18"/>
+        </w:rPr>
+        <w:t xml:space="preserve"> app for configuring Ackcio Beam devices.</w:t>
       </w:r>
     </w:p>
     <w:p>
@@ -921,6 +1786,10 @@
       <w:r>
         <w:rPr>
           <w:rFonts w:ascii="Calibri" w:cs="Calibri" w:eastAsia="Calibri" w:hAnsi="Calibri"/>
+          <w:b w:val="false"/>
+          <w:bCs w:val="false"/>
+          <w:i w:val="false"/>
+          <w:iCs w:val="false"/>
           <w:color w:val="222222"/>
           <w:sz w:val="18"/>
           <w:szCs w:val="18"/>
@@ -942,6 +1811,10 @@
       <w:r>
         <w:rPr>
           <w:rFonts w:ascii="Calibri" w:cs="Calibri" w:eastAsia="Calibri" w:hAnsi="Calibri"/>
+          <w:b w:val="false"/>
+          <w:bCs w:val="false"/>
+          <w:i w:val="false"/>
+          <w:iCs w:val="false"/>
           <w:color w:val="222222"/>
           <w:sz w:val="18"/>
           <w:szCs w:val="18"/>
@@ -983,6 +1856,8 @@
           <w:rFonts w:ascii="Calibri" w:cs="Calibri" w:eastAsia="Calibri" w:hAnsi="Calibri"/>
           <w:b/>
           <w:bCs/>
+          <w:i w:val="false"/>
+          <w:iCs w:val="false"/>
           <w:color w:val="222222"/>
           <w:sz w:val="19"/>
           <w:szCs w:val="19"/>
@@ -1010,13 +1885,28 @@
       <w:r>
         <w:rPr>
           <w:rFonts w:ascii="Calibri" w:cs="Calibri" w:eastAsia="Calibri" w:hAnsi="Calibri"/>
+          <w:b/>
+          <w:bCs/>
+          <w:i/>
+          <w:iCs/>
+          <w:color w:val="1D4ED8"/>
+          <w:sz w:val="17"/>
+          <w:szCs w:val="17"/>
+        </w:rPr>
+        <w:t xml:space="preserve">iOS</w:t>
+      </w:r>
+      <w:r>
+        <w:rPr>
+          <w:rFonts w:ascii="Calibri" w:cs="Calibri" w:eastAsia="Calibri" w:hAnsi="Calibri"/>
+          <w:b w:val="false"/>
+          <w:bCs w:val="false"/>
           <w:i/>
           <w:iCs/>
           <w:color w:val="555555"/>
           <w:sz w:val="17"/>
           <w:szCs w:val="17"/>
         </w:rPr>
-        <w:t xml:space="preserve">iOS — Swift, SwiftUI, Combine, MVVM, Firebase, Objective-C</w:t>
+        <w:t xml:space="preserve"> — Swift, SwiftUI, Combine, MVVM, Firebase, Objective-C</w:t>
       </w:r>
     </w:p>
     <w:p>
@@ -1033,11 +1923,41 @@
       <w:r>
         <w:rPr>
           <w:rFonts w:ascii="Calibri" w:cs="Calibri" w:eastAsia="Calibri" w:hAnsi="Calibri"/>
-          <w:color w:val="222222"/>
-          <w:sz w:val="18"/>
-          <w:szCs w:val="18"/>
-        </w:rPr>
-        <w:t xml:space="preserve">Modernized a legacy iOS app, introducing a SwiftUI + Combine architecture and improving responsiveness and UX.</w:t>
+          <w:b w:val="false"/>
+          <w:bCs w:val="false"/>
+          <w:i w:val="false"/>
+          <w:iCs w:val="false"/>
+          <w:color w:val="222222"/>
+          <w:sz w:val="18"/>
+          <w:szCs w:val="18"/>
+        </w:rPr>
+        <w:t xml:space="preserve">Modernized a legacy </w:t>
+      </w:r>
+      <w:r>
+        <w:rPr>
+          <w:rFonts w:ascii="Calibri" w:cs="Calibri" w:eastAsia="Calibri" w:hAnsi="Calibri"/>
+          <w:b/>
+          <w:bCs/>
+          <w:i w:val="false"/>
+          <w:iCs w:val="false"/>
+          <w:color w:val="1D4ED8"/>
+          <w:sz w:val="18"/>
+          <w:szCs w:val="18"/>
+        </w:rPr>
+        <w:t xml:space="preserve">iOS</w:t>
+      </w:r>
+      <w:r>
+        <w:rPr>
+          <w:rFonts w:ascii="Calibri" w:cs="Calibri" w:eastAsia="Calibri" w:hAnsi="Calibri"/>
+          <w:b w:val="false"/>
+          <w:bCs w:val="false"/>
+          <w:i w:val="false"/>
+          <w:iCs w:val="false"/>
+          <w:color w:val="222222"/>
+          <w:sz w:val="18"/>
+          <w:szCs w:val="18"/>
+        </w:rPr>
+        <w:t xml:space="preserve"> app, introducing a SwiftUI + Combine architecture and improving responsiveness and UX.</w:t>
       </w:r>
     </w:p>
     <w:p>
@@ -1054,6 +1974,8 @@
           <w:rFonts w:ascii="Calibri" w:cs="Calibri" w:eastAsia="Calibri" w:hAnsi="Calibri"/>
           <w:b/>
           <w:bCs/>
+          <w:i w:val="false"/>
+          <w:iCs w:val="false"/>
           <w:color w:val="222222"/>
           <w:sz w:val="19"/>
           <w:szCs w:val="19"/>
@@ -1081,13 +2003,67 @@
       <w:r>
         <w:rPr>
           <w:rFonts w:ascii="Calibri" w:cs="Calibri" w:eastAsia="Calibri" w:hAnsi="Calibri"/>
+          <w:b w:val="false"/>
+          <w:bCs w:val="false"/>
           <w:i/>
           <w:iCs/>
           <w:color w:val="555555"/>
           <w:sz w:val="17"/>
           <w:szCs w:val="17"/>
         </w:rPr>
-        <w:t xml:space="preserve">SwiftUI (iOS) &amp; Kotlin / Jetpack Compose (Android)</w:t>
+        <w:t xml:space="preserve">SwiftUI (</w:t>
+      </w:r>
+      <w:r>
+        <w:rPr>
+          <w:rFonts w:ascii="Calibri" w:cs="Calibri" w:eastAsia="Calibri" w:hAnsi="Calibri"/>
+          <w:b/>
+          <w:bCs/>
+          <w:i/>
+          <w:iCs/>
+          <w:color w:val="1D4ED8"/>
+          <w:sz w:val="17"/>
+          <w:szCs w:val="17"/>
+        </w:rPr>
+        <w:t xml:space="preserve">iOS</w:t>
+      </w:r>
+      <w:r>
+        <w:rPr>
+          <w:rFonts w:ascii="Calibri" w:cs="Calibri" w:eastAsia="Calibri" w:hAnsi="Calibri"/>
+          <w:b w:val="false"/>
+          <w:bCs w:val="false"/>
+          <w:i/>
+          <w:iCs/>
+          <w:color w:val="555555"/>
+          <w:sz w:val="17"/>
+          <w:szCs w:val="17"/>
+        </w:rPr>
+        <w:t xml:space="preserve">) &amp; Kotlin / Jetpack Compose (</w:t>
+      </w:r>
+      <w:r>
+        <w:rPr>
+          <w:rFonts w:ascii="Calibri" w:cs="Calibri" w:eastAsia="Calibri" w:hAnsi="Calibri"/>
+          <w:b/>
+          <w:bCs/>
+          <w:i/>
+          <w:iCs/>
+          <w:color w:val="1D4ED8"/>
+          <w:sz w:val="17"/>
+          <w:szCs w:val="17"/>
+        </w:rPr>
+        <w:t xml:space="preserve">Android</w:t>
+      </w:r>
+      <w:r>
+        <w:rPr>
+          <w:rFonts w:ascii="Calibri" w:cs="Calibri" w:eastAsia="Calibri" w:hAnsi="Calibri"/>
+          <w:b w:val="false"/>
+          <w:bCs w:val="false"/>
+          <w:i/>
+          <w:iCs/>
+          <w:color w:val="555555"/>
+          <w:sz w:val="17"/>
+          <w:szCs w:val="17"/>
+        </w:rPr>
+        <w:t xml:space="preserve">)</w:t>
       </w:r>
     </w:p>
     <w:p>
@@ -1104,6 +2080,10 @@
       <w:r>
         <w:rPr>
           <w:rFonts w:ascii="Calibri" w:cs="Calibri" w:eastAsia="Calibri" w:hAnsi="Calibri"/>
+          <w:b w:val="false"/>
+          <w:bCs w:val="false"/>
+          <w:i w:val="false"/>
+          <w:iCs w:val="false"/>
           <w:color w:val="222222"/>
           <w:sz w:val="18"/>
           <w:szCs w:val="18"/>
@@ -1145,6 +2125,8 @@
           <w:rFonts w:ascii="Calibri" w:cs="Calibri" w:eastAsia="Calibri" w:hAnsi="Calibri"/>
           <w:b/>
           <w:bCs/>
+          <w:i w:val="false"/>
+          <w:iCs w:val="false"/>
           <w:color w:val="222222"/>
           <w:sz w:val="19"/>
           <w:szCs w:val="19"/>
@@ -1172,6 +2154,8 @@
       <w:r>
         <w:rPr>
           <w:rFonts w:ascii="Calibri" w:cs="Calibri" w:eastAsia="Calibri" w:hAnsi="Calibri"/>
+          <w:b w:val="false"/>
+          <w:bCs w:val="false"/>
           <w:i/>
           <w:iCs/>
           <w:color w:val="555555"/>
@@ -1195,6 +2179,8 @@
           <w:rFonts w:ascii="Calibri" w:cs="Calibri" w:eastAsia="Calibri" w:hAnsi="Calibri"/>
           <w:b/>
           <w:bCs/>
+          <w:i w:val="false"/>
+          <w:iCs w:val="false"/>
           <w:color w:val="222222"/>
           <w:sz w:val="19"/>
           <w:szCs w:val="19"/>
@@ -1222,6 +2208,8 @@
       <w:r>
         <w:rPr>
           <w:rFonts w:ascii="Calibri" w:cs="Calibri" w:eastAsia="Calibri" w:hAnsi="Calibri"/>
+          <w:b w:val="false"/>
+          <w:bCs w:val="false"/>
           <w:i/>
           <w:iCs/>
           <w:color w:val="555555"/>
@@ -1265,6 +2253,8 @@
           <w:rFonts w:ascii="Calibri" w:cs="Calibri" w:eastAsia="Calibri" w:hAnsi="Calibri"/>
           <w:b/>
           <w:bCs/>
+          <w:i w:val="false"/>
+          <w:iCs w:val="false"/>
           <w:color w:val="222222"/>
           <w:sz w:val="19"/>
           <w:szCs w:val="19"/>
@@ -1292,13 +2282,41 @@
       <w:r>
         <w:rPr>
           <w:rFonts w:ascii="Calibri" w:cs="Calibri" w:eastAsia="Calibri" w:hAnsi="Calibri"/>
+          <w:b w:val="false"/>
+          <w:bCs w:val="false"/>
           <w:i/>
           <w:iCs/>
           <w:color w:val="555555"/>
           <w:sz w:val="17"/>
           <w:szCs w:val="17"/>
         </w:rPr>
-        <w:t xml:space="preserve">Technologies: Python, Machine Learning, Android, Kotlin, Java, Firebase, SQLite</w:t>
+        <w:t xml:space="preserve">Technologies: Python, Machine Learning, </w:t>
+      </w:r>
+      <w:r>
+        <w:rPr>
+          <w:rFonts w:ascii="Calibri" w:cs="Calibri" w:eastAsia="Calibri" w:hAnsi="Calibri"/>
+          <w:b/>
+          <w:bCs/>
+          <w:i/>
+          <w:iCs/>
+          <w:color w:val="1D4ED8"/>
+          <w:sz w:val="17"/>
+          <w:szCs w:val="17"/>
+        </w:rPr>
+        <w:t xml:space="preserve">Android</w:t>
+      </w:r>
+      <w:r>
+        <w:rPr>
+          <w:rFonts w:ascii="Calibri" w:cs="Calibri" w:eastAsia="Calibri" w:hAnsi="Calibri"/>
+          <w:b w:val="false"/>
+          <w:bCs w:val="false"/>
+          <w:i/>
+          <w:iCs/>
+          <w:color w:val="555555"/>
+          <w:sz w:val="17"/>
+          <w:szCs w:val="17"/>
+        </w:rPr>
+        <w:t xml:space="preserve">, Kotlin, Java, Firebase, SQLite</w:t>
       </w:r>
     </w:p>
     <w:p>
@@ -1315,11 +2333,41 @@
       <w:r>
         <w:rPr>
           <w:rFonts w:ascii="Calibri" w:cs="Calibri" w:eastAsia="Calibri" w:hAnsi="Calibri"/>
-          <w:color w:val="222222"/>
-          <w:sz w:val="18"/>
-          <w:szCs w:val="18"/>
-        </w:rPr>
-        <w:t xml:space="preserve">Awarded for SIFAA, a final-year university project using reinforcement learning, built with Android Studio, Firebase, Java, Kotlin, and Python.</w:t>
+          <w:b w:val="false"/>
+          <w:bCs w:val="false"/>
+          <w:i w:val="false"/>
+          <w:iCs w:val="false"/>
+          <w:color w:val="222222"/>
+          <w:sz w:val="18"/>
+          <w:szCs w:val="18"/>
+        </w:rPr>
+        <w:t xml:space="preserve">Awarded for SIFAA, a final-year university project using reinforcement learning, built with </w:t>
+      </w:r>
+      <w:r>
+        <w:rPr>
+          <w:rFonts w:ascii="Calibri" w:cs="Calibri" w:eastAsia="Calibri" w:hAnsi="Calibri"/>
+          <w:b/>
+          <w:bCs/>
+          <w:i w:val="false"/>
+          <w:iCs w:val="false"/>
+          <w:color w:val="1D4ED8"/>
+          <w:sz w:val="18"/>
+          <w:szCs w:val="18"/>
+        </w:rPr>
+        <w:t xml:space="preserve">Android</w:t>
+      </w:r>
+      <w:r>
+        <w:rPr>
+          <w:rFonts w:ascii="Calibri" w:cs="Calibri" w:eastAsia="Calibri" w:hAnsi="Calibri"/>
+          <w:b w:val="false"/>
+          <w:bCs w:val="false"/>
+          <w:i w:val="false"/>
+          <w:iCs w:val="false"/>
+          <w:color w:val="222222"/>
+          <w:sz w:val="18"/>
+          <w:szCs w:val="18"/>
+        </w:rPr>
+        <w:t xml:space="preserve"> Studio, Firebase, Java, Kotlin, and Python.</w:t>
       </w:r>
     </w:p>
     <w:p>
@@ -1356,6 +2404,10 @@
       <w:r>
         <w:rPr>
           <w:rFonts w:ascii="Calibri" w:cs="Calibri" w:eastAsia="Calibri" w:hAnsi="Calibri"/>
+          <w:b w:val="false"/>
+          <w:bCs w:val="false"/>
+          <w:i w:val="false"/>
+          <w:iCs w:val="false"/>
           <w:color w:val="222222"/>
           <w:sz w:val="18"/>
           <w:szCs w:val="18"/>
@@ -1377,6 +2429,10 @@
       <w:r>
         <w:rPr>
           <w:rFonts w:ascii="Calibri" w:cs="Calibri" w:eastAsia="Calibri" w:hAnsi="Calibri"/>
+          <w:b w:val="false"/>
+          <w:bCs w:val="false"/>
+          <w:i w:val="false"/>
+          <w:iCs w:val="false"/>
           <w:color w:val="222222"/>
           <w:sz w:val="18"/>
           <w:szCs w:val="18"/>
@@ -1398,6 +2454,10 @@
       <w:r>
         <w:rPr>
           <w:rFonts w:ascii="Calibri" w:cs="Calibri" w:eastAsia="Calibri" w:hAnsi="Calibri"/>
+          <w:b w:val="false"/>
+          <w:bCs w:val="false"/>
+          <w:i w:val="false"/>
+          <w:iCs w:val="false"/>
           <w:color w:val="222222"/>
           <w:sz w:val="18"/>
           <w:szCs w:val="18"/>
@@ -1419,6 +2479,10 @@
       <w:r>
         <w:rPr>
           <w:rFonts w:ascii="Calibri" w:cs="Calibri" w:eastAsia="Calibri" w:hAnsi="Calibri"/>
+          <w:b w:val="false"/>
+          <w:bCs w:val="false"/>
+          <w:i w:val="false"/>
+          <w:iCs w:val="false"/>
           <w:color w:val="222222"/>
           <w:sz w:val="18"/>
           <w:szCs w:val="18"/>
@@ -1440,6 +2504,10 @@
       <w:r>
         <w:rPr>
           <w:rFonts w:ascii="Calibri" w:cs="Calibri" w:eastAsia="Calibri" w:hAnsi="Calibri"/>
+          <w:b w:val="false"/>
+          <w:bCs w:val="false"/>
+          <w:i w:val="false"/>
+          <w:iCs w:val="false"/>
           <w:color w:val="222222"/>
           <w:sz w:val="18"/>
           <w:szCs w:val="18"/>
@@ -1461,6 +2529,10 @@
       <w:r>
         <w:rPr>
           <w:rFonts w:ascii="Calibri" w:cs="Calibri" w:eastAsia="Calibri" w:hAnsi="Calibri"/>
+          <w:b w:val="false"/>
+          <w:bCs w:val="false"/>
+          <w:i w:val="false"/>
+          <w:iCs w:val="false"/>
           <w:color w:val="222222"/>
           <w:sz w:val="18"/>
           <w:szCs w:val="18"/>

</xml_diff>

<commit_message>
Add country next to company name in CV experience entries
Also fixes LiveRoom (Pvt) Ltd, which previously had no location line
at all.

Co-Authored-By: Claude Sonnet 5 <noreply@anthropic.com>
</commit_message>
<xml_diff>
--- a/pdf/Malindu_Kirindegamaarachchi_CV.docx
+++ b/pdf/Malindu_Kirindegamaarachchi_CV.docx
@@ -157,7 +157,7 @@
       <w:pPr>
         <w:spacing w:after="120"/>
       </w:pPr>
-      <w:hyperlink w:history="1" r:id="rIdagxw9jjpjwlbc7s3onjpi">
+      <w:hyperlink w:history="1" r:id="rIdc4vrugithhd6i8qcwldxk">
         <w:r>
           <w:rPr>
             <w:rFonts w:ascii="Calibri" w:cs="Calibri" w:eastAsia="Calibri" w:hAnsi="Calibri"/>
@@ -196,7 +196,7 @@
         </w:rPr>
         <w:t xml:space="preserve">   |   </w:t>
       </w:r>
-      <w:hyperlink w:history="1" r:id="rIdu7d_dou6nqsfxff0pht3p">
+      <w:hyperlink w:history="1" r:id="rIdgfo3lrfsgmltvdz2vxxrv">
         <w:r>
           <w:rPr>
             <w:rFonts w:ascii="Calibri" w:cs="Calibri" w:eastAsia="Calibri" w:hAnsi="Calibri"/>
@@ -217,7 +217,7 @@
         </w:rPr>
         <w:t xml:space="preserve">   |   </w:t>
       </w:r>
-      <w:hyperlink w:history="1" r:id="rId72hy4ykidk_q0ttcxv1eo">
+      <w:hyperlink w:history="1" r:id="rIdtyr0aos2rbzpbiskrnewq">
         <w:r>
           <w:rPr>
             <w:rFonts w:ascii="Calibri" w:cs="Calibri" w:eastAsia="Calibri" w:hAnsi="Calibri"/>
@@ -238,7 +238,7 @@
         </w:rPr>
         <w:t xml:space="preserve">   |   </w:t>
       </w:r>
-      <w:hyperlink w:history="1" r:id="rIdchfpj1bxmcop_nijwnacg">
+      <w:hyperlink w:history="1" r:id="rIdn50xgweluzn44xk5megx-">
         <w:r>
           <w:rPr>
             <w:rFonts w:ascii="Calibri" w:cs="Calibri" w:eastAsia="Calibri" w:hAnsi="Calibri"/>
@@ -460,7 +460,7 @@
           <w:sz w:val="19"/>
           <w:szCs w:val="19"/>
         </w:rPr>
-        <w:t xml:space="preserve">Senior Mobile Engineer — Apadmi</w:t>
+        <w:t xml:space="preserve">Senior Mobile Engineer — Apadmi, UK</w:t>
       </w:r>
       <w:r>
         <w:rPr>
@@ -643,7 +643,7 @@
           <w:sz w:val="19"/>
           <w:szCs w:val="19"/>
         </w:rPr>
-        <w:t xml:space="preserve"> — Digmi AB (via Lucytech)</w:t>
+        <w:t xml:space="preserve"> — Digmi AB (via Lucytech), Sweden</w:t>
       </w:r>
       <w:r>
         <w:rPr>
@@ -927,7 +927,7 @@
           <w:sz w:val="19"/>
           <w:szCs w:val="19"/>
         </w:rPr>
-        <w:t xml:space="preserve"> (Contract) — Zone24x7</w:t>
+        <w:t xml:space="preserve"> (Contract) — Zone24x7, USA</w:t>
       </w:r>
       <w:r>
         <w:rPr>
@@ -1083,7 +1083,7 @@
           <w:sz w:val="19"/>
           <w:szCs w:val="19"/>
         </w:rPr>
-        <w:t xml:space="preserve"> (Contract) — Circles</w:t>
+        <w:t xml:space="preserve"> (Contract) — Circles, Singapore</w:t>
       </w:r>
       <w:r>
         <w:rPr>
@@ -1240,7 +1240,7 @@
           <w:sz w:val="19"/>
           <w:szCs w:val="19"/>
         </w:rPr>
-        <w:t xml:space="preserve"> — Doc990 (Dialog Axiata PLC)</w:t>
+        <w:t xml:space="preserve"> — Doc990 (Dialog Axiata PLC), Sri Lanka</w:t>
       </w:r>
       <w:r>
         <w:rPr>
@@ -1396,7 +1396,7 @@
           <w:sz w:val="19"/>
           <w:szCs w:val="19"/>
         </w:rPr>
-        <w:t xml:space="preserve"> — Doc990 (Dialog Axiata PLC)</w:t>
+        <w:t xml:space="preserve"> — Doc990 (Dialog Axiata PLC), Sri Lanka</w:t>
       </w:r>
       <w:r>
         <w:rPr>
@@ -1552,7 +1552,7 @@
           <w:sz w:val="19"/>
           <w:szCs w:val="19"/>
         </w:rPr>
-        <w:t xml:space="preserve">Tech Lead — Mobile — Arkhe Ventures</w:t>
+        <w:t xml:space="preserve">Tech Lead — Mobile — Arkhe Ventures, Australia</w:t>
       </w:r>
       <w:r>
         <w:rPr>
@@ -1707,7 +1707,7 @@
           <w:sz w:val="19"/>
           <w:szCs w:val="19"/>
         </w:rPr>
-        <w:t xml:space="preserve">, React Native — LiveRoom (Pvt) Ltd</w:t>
+        <w:t xml:space="preserve">, React Native — LiveRoom (Pvt) Ltd, Sri Lanka</w:t>
       </w:r>
       <w:r>
         <w:rPr>

</xml_diff>

<commit_message>
Add prominent Portfolio link with globe icon to CV header
Places a bold, larger "Portfolio" hyperlink with a globe icon in the
top-right corner next to the name, linking to the live portfolio site.
Removed the now-duplicate "Portfolio" text link from the contact line.

Co-Authored-By: Claude Sonnet 5 <noreply@anthropic.com>
</commit_message>
<xml_diff>
--- a/pdf/Malindu_Kirindegamaarachchi_CV.docx
+++ b/pdf/Malindu_Kirindegamaarachchi_CV.docx
@@ -2,22 +2,128 @@
 <file path=word/document.xml><?xml version="1.0" encoding="utf-8"?>
 <w:document xmlns:wpc="http://schemas.microsoft.com/office/word/2010/wordprocessingCanvas" xmlns:mc="http://schemas.openxmlformats.org/markup-compatibility/2006" xmlns:o="urn:schemas-microsoft-com:office:office" xmlns:r="http://schemas.openxmlformats.org/officeDocument/2006/relationships" xmlns:m="http://schemas.openxmlformats.org/officeDocument/2006/math" xmlns:v="urn:schemas-microsoft-com:vml" xmlns:wp14="http://schemas.microsoft.com/office/word/2010/wordprocessingDrawing" xmlns:wp="http://schemas.openxmlformats.org/drawingml/2006/wordprocessingDrawing" xmlns:w10="urn:schemas-microsoft-com:office:word" xmlns:w="http://schemas.openxmlformats.org/wordprocessingml/2006/main" xmlns:w14="http://schemas.microsoft.com/office/word/2010/wordml" xmlns:w15="http://schemas.microsoft.com/office/word/2012/wordml" xmlns:wpg="http://schemas.microsoft.com/office/word/2010/wordprocessingGroup" xmlns:wpi="http://schemas.microsoft.com/office/word/2010/wordprocessingInk" xmlns:wne="http://schemas.microsoft.com/office/word/2006/wordml" xmlns:wps="http://schemas.microsoft.com/office/word/2010/wordprocessingShape" xmlns:cx="http://schemas.microsoft.com/office/drawing/2014/chartex" xmlns:cx1="http://schemas.microsoft.com/office/drawing/2015/9/8/chartex" xmlns:cx2="http://schemas.microsoft.com/office/drawing/2015/10/21/chartex" xmlns:cx3="http://schemas.microsoft.com/office/drawing/2016/5/9/chartex" xmlns:cx4="http://schemas.microsoft.com/office/drawing/2016/5/10/chartex" xmlns:cx5="http://schemas.microsoft.com/office/drawing/2016/5/11/chartex" xmlns:cx6="http://schemas.microsoft.com/office/drawing/2016/5/12/chartex" xmlns:cx7="http://schemas.microsoft.com/office/drawing/2016/5/13/chartex" xmlns:cx8="http://schemas.microsoft.com/office/drawing/2016/5/14/chartex" xmlns:aink="http://schemas.microsoft.com/office/drawing/2016/ink" xmlns:am3d="http://schemas.microsoft.com/office/drawing/2017/model3d" xmlns:w16cex="http://schemas.microsoft.com/office/word/2018/wordml/cex" xmlns:w16cid="http://schemas.microsoft.com/office/word/2016/wordml/cid" xmlns:w16="http://schemas.microsoft.com/office/word/2018/wordml" xmlns:w16sdtdh="http://schemas.microsoft.com/office/word/2020/wordml/sdtdatahash" xmlns:w16se="http://schemas.microsoft.com/office/word/2015/wordml/symex" mc:Ignorable="w14 w15 wp14">
   <w:body>
-    <w:p>
-      <w:pPr>
-        <w:spacing w:after="20"/>
-      </w:pPr>
-      <w:r>
-        <w:rPr>
-          <w:rFonts w:ascii="Calibri" w:cs="Calibri" w:eastAsia="Calibri" w:hAnsi="Calibri"/>
-          <w:b/>
-          <w:bCs/>
-          <w:color w:val="222222"/>
-          <w:sz w:val="44"/>
-          <w:szCs w:val="44"/>
-        </w:rPr>
-        <w:t xml:space="preserve">Malindu Kirindegamaarachchi</w:t>
-      </w:r>
-    </w:p>
+    <w:tbl>
+      <w:tblPr>
+        <w:tblW w:type="dxa" w:w="10800"/>
+        <w:tblBorders>
+          <w:top w:val="single" w:color="auto" w:sz="4"/>
+          <w:left w:val="single" w:color="auto" w:sz="4"/>
+          <w:bottom w:val="single" w:color="auto" w:sz="4"/>
+          <w:right w:val="single" w:color="auto" w:sz="4"/>
+          <w:insideH w:val="single" w:color="auto" w:sz="4"/>
+          <w:insideV w:val="single" w:color="auto" w:sz="4"/>
+        </w:tblBorders>
+      </w:tblPr>
+      <w:tblGrid>
+        <w:gridCol w:w="7800"/>
+        <w:gridCol w:w="3000"/>
+      </w:tblGrid>
+      <w:tr>
+        <w:tc>
+          <w:tcPr>
+            <w:tcW w:type="dxa" w:w="7800"/>
+            <w:tcBorders>
+              <w:top w:val="none" w:color="FFFFFF" w:sz="0"/>
+              <w:left w:val="none" w:color="FFFFFF" w:sz="0"/>
+              <w:bottom w:val="none" w:color="FFFFFF" w:sz="0"/>
+              <w:right w:val="none" w:color="FFFFFF" w:sz="0"/>
+            </w:tcBorders>
+            <w:vAlign w:val="center"/>
+          </w:tcPr>
+          <w:p>
+            <w:pPr>
+              <w:spacing w:after="20"/>
+            </w:pPr>
+            <w:r>
+              <w:rPr>
+                <w:rFonts w:ascii="Calibri" w:cs="Calibri" w:eastAsia="Calibri" w:hAnsi="Calibri"/>
+                <w:b/>
+                <w:bCs/>
+                <w:color w:val="222222"/>
+                <w:sz w:val="44"/>
+                <w:szCs w:val="44"/>
+              </w:rPr>
+              <w:t xml:space="preserve">Malindu Kirindegamaarachchi</w:t>
+            </w:r>
+          </w:p>
+        </w:tc>
+        <w:tc>
+          <w:tcPr>
+            <w:tcW w:type="dxa" w:w="3000"/>
+            <w:tcBorders>
+              <w:top w:val="none" w:color="FFFFFF" w:sz="0"/>
+              <w:left w:val="none" w:color="FFFFFF" w:sz="0"/>
+              <w:bottom w:val="none" w:color="FFFFFF" w:sz="0"/>
+              <w:right w:val="none" w:color="FFFFFF" w:sz="0"/>
+            </w:tcBorders>
+            <w:vAlign w:val="center"/>
+          </w:tcPr>
+          <w:p>
+            <w:pPr>
+              <w:jc w:val="right"/>
+            </w:pPr>
+            <w:hyperlink w:history="1" r:id="rIdnomeeytzum2p1g0dniazq">
+              <w:r>
+                <w:drawing>
+                  <wp:inline distT="0" distB="0" distL="0" distR="0">
+                    <wp:extent cx="152400" cy="152400"/>
+                    <wp:effectExtent t="0" r="0" b="0" l="0"/>
+                    <wp:docPr id="1" name="" descr="" title="">
+                      <a:hlinkClick xmlns:a="http://schemas.openxmlformats.org/drawingml/2006/main" r:id="rIdnomeeytzum2p1g0dniazq"/>
+                    </wp:docPr>
+                    <wp:cNvGraphicFramePr>
+                      <a:graphicFrameLocks xmlns:a="http://schemas.openxmlformats.org/drawingml/2006/main" noChangeAspect="1"/>
+                    </wp:cNvGraphicFramePr>
+                    <a:graphic xmlns:a="http://schemas.openxmlformats.org/drawingml/2006/main">
+                      <a:graphicData uri="http://schemas.openxmlformats.org/drawingml/2006/picture">
+                        <pic:pic xmlns:pic="http://schemas.openxmlformats.org/drawingml/2006/picture">
+                          <pic:nvPicPr>
+                            <pic:cNvPr id="0" name="" descr="">
+                              <a:hlinkClick r:id="rIdnomeeytzum2p1g0dniazq"/>
+                            </pic:cNvPr>
+                            <pic:cNvPicPr>
+                              <a:picLocks noChangeAspect="1" noChangeArrowheads="1"/>
+                            </pic:cNvPicPr>
+                          </pic:nvPicPr>
+                          <pic:blipFill>
+                            <a:blip r:embed="rId7" cstate="none"/>
+                            <a:srcRect/>
+                            <a:stretch>
+                              <a:fillRect/>
+                            </a:stretch>
+                          </pic:blipFill>
+                          <pic:spPr bwMode="auto">
+                            <a:xfrm>
+                              <a:off x="0" y="0"/>
+                              <a:ext cx="152400" cy="152400"/>
+                            </a:xfrm>
+                            <a:prstGeom prst="rect">
+                              <a:avLst/>
+                            </a:prstGeom>
+                          </pic:spPr>
+                        </pic:pic>
+                      </a:graphicData>
+                    </a:graphic>
+                  </wp:inline>
+                </w:drawing>
+              </w:r>
+              <w:r>
+                <w:rPr>
+                  <w:rFonts w:ascii="Calibri" w:cs="Calibri" w:eastAsia="Calibri" w:hAnsi="Calibri"/>
+                  <w:b/>
+                  <w:bCs/>
+                  <w:color w:val="B3121C"/>
+                  <w:sz w:val="26"/>
+                  <w:szCs w:val="26"/>
+                  <w:u w:val="single"/>
+                </w:rPr>
+                <w:t xml:space="preserve"> Portfolio</w:t>
+              </w:r>
+            </w:hyperlink>
+          </w:p>
+        </w:tc>
+      </w:tr>
+    </w:tbl>
     <w:p>
       <w:pPr>
         <w:spacing w:after="60"/>
@@ -157,7 +263,7 @@
       <w:pPr>
         <w:spacing w:after="120"/>
       </w:pPr>
-      <w:hyperlink w:history="1" r:id="rIdc4vrugithhd6i8qcwldxk">
+      <w:hyperlink w:history="1" r:id="rIdqtysd4ku9c9kmoqk0_ryf">
         <w:r>
           <w:rPr>
             <w:rFonts w:ascii="Calibri" w:cs="Calibri" w:eastAsia="Calibri" w:hAnsi="Calibri"/>
@@ -196,7 +302,7 @@
         </w:rPr>
         <w:t xml:space="preserve">   |   </w:t>
       </w:r>
-      <w:hyperlink w:history="1" r:id="rIdgfo3lrfsgmltvdz2vxxrv">
+      <w:hyperlink w:history="1" r:id="rIdmoew7ikidqbl2qotxgpst">
         <w:r>
           <w:rPr>
             <w:rFonts w:ascii="Calibri" w:cs="Calibri" w:eastAsia="Calibri" w:hAnsi="Calibri"/>
@@ -217,7 +323,7 @@
         </w:rPr>
         <w:t xml:space="preserve">   |   </w:t>
       </w:r>
-      <w:hyperlink w:history="1" r:id="rIdtyr0aos2rbzpbiskrnewq">
+      <w:hyperlink w:history="1" r:id="rIdatfabr5kygpqgigvi_053">
         <w:r>
           <w:rPr>
             <w:rFonts w:ascii="Calibri" w:cs="Calibri" w:eastAsia="Calibri" w:hAnsi="Calibri"/>
@@ -227,27 +333,6 @@
             <w:u w:val="single"/>
           </w:rPr>
           <w:t xml:space="preserve">GitHub</w:t>
-        </w:r>
-      </w:hyperlink>
-      <w:r>
-        <w:rPr>
-          <w:rFonts w:ascii="Calibri" w:cs="Calibri" w:eastAsia="Calibri" w:hAnsi="Calibri"/>
-          <w:color w:val="555555"/>
-          <w:sz w:val="17"/>
-          <w:szCs w:val="17"/>
-        </w:rPr>
-        <w:t xml:space="preserve">   |   </w:t>
-      </w:r>
-      <w:hyperlink w:history="1" r:id="rIdn50xgweluzn44xk5megx-">
-        <w:r>
-          <w:rPr>
-            <w:rFonts w:ascii="Calibri" w:cs="Calibri" w:eastAsia="Calibri" w:hAnsi="Calibri"/>
-            <w:color w:val="B3121C"/>
-            <w:sz w:val="17"/>
-            <w:szCs w:val="17"/>
-            <w:u w:val="single"/>
-          </w:rPr>
-          <w:t xml:space="preserve">Portfolio</w:t>
         </w:r>
       </w:hyperlink>
     </w:p>

</xml_diff>